<commit_message>
Worksheet for eigenvalues updated answer sheet to include more detailed explanations and additional examples for better understanding of the concepts. The PDF and Word document have both been modified to reflect these changes.
</commit_message>
<xml_diff>
--- a/worksheets/wordDocs/EigenValuesVectors_Investigation_Answers.docx
+++ b/worksheets/wordDocs/EigenValuesVectors_Investigation_Answers.docx
@@ -23,31 +23,7 @@
           <w:sz w:val="22"/>
           <w:szCs w:val="22"/>
         </w:rPr>
-        <w:t xml:space="preserve">In this activity you will explore how different vectors behave under transformations. Use </w:t>
-      </w:r>
-      <w:proofErr w:type="spellStart"/>
-      <w:r>
-        <w:rPr>
-          <w:b/>
-          <w:bCs/>
-          <w:i/>
-          <w:iCs/>
-          <w:sz w:val="22"/>
-          <w:szCs w:val="22"/>
-        </w:rPr>
-        <w:t>Vectorama</w:t>
-      </w:r>
-      <w:proofErr w:type="spellEnd"/>
-      <w:r>
-        <w:rPr>
-          <w:b/>
-          <w:bCs/>
-          <w:i/>
-          <w:iCs/>
-          <w:sz w:val="22"/>
-          <w:szCs w:val="22"/>
-        </w:rPr>
-        <w:t xml:space="preserve"> to observe patterns and describe what you notice.</w:t>
+        <w:t>In this activity you will explore how different vectors behave under transformations. Use Vectorama to observe patterns and describe what you notice.</w:t>
       </w:r>
     </w:p>
     <w:p>
@@ -121,15 +97,7 @@
         </w:drawing>
       </w:r>
       <w:r>
-        <w:t xml:space="preserve">Open </w:t>
-      </w:r>
-      <w:proofErr w:type="spellStart"/>
-      <w:r>
-        <w:t>Vectorama</w:t>
-      </w:r>
-      <w:proofErr w:type="spellEnd"/>
-      <w:r>
-        <w:t xml:space="preserve"> (</w:t>
+        <w:t>Open Vectorama (</w:t>
       </w:r>
       <w:hyperlink r:id="rId8" w:history="1">
         <w:r>
@@ -255,13 +223,26 @@
             </w:r>
           </w:p>
           <w:p/>
-          <w:p/>
           <w:p>
             <w:r>
               <w:t>Where does each point on the line x = 2 get mapped to under this transformation?</w:t>
             </w:r>
             <w:r>
+              <w:t xml:space="preserve"> </w:t>
+            </w:r>
+            <w:r>
+              <w:rPr>
+                <w:color w:val="4EA72E" w:themeColor="accent6"/>
+              </w:rPr>
+              <w:t>Another point on the same line</w:t>
+            </w:r>
+            <w:r>
+              <w:rPr>
+                <w:color w:val="4EA72E" w:themeColor="accent6"/>
+              </w:rPr>
               <w:br/>
+            </w:r>
+            <w:r>
               <w:t>What might this line be called?</w:t>
             </w:r>
             <w:r>
@@ -343,24 +324,28 @@
           </w:p>
           <w:p/>
           <w:p>
+            <w:pPr>
+              <w:rPr>
+                <w:color w:val="4EA72E" w:themeColor="accent6"/>
+              </w:rPr>
+            </w:pPr>
             <w:r>
               <w:t>Compare what you see now with what you observed in Exercise 1.</w:t>
             </w:r>
             <w:r>
               <w:br/>
             </w:r>
-          </w:p>
-          <w:p>
-            <w:pPr>
+            <w:r>
               <w:rPr>
                 <w:color w:val="4EA72E" w:themeColor="accent6"/>
               </w:rPr>
-            </w:pPr>
+              <w:t>The direction of each vector changes</w:t>
+            </w:r>
             <w:r>
               <w:rPr>
                 <w:color w:val="4EA72E" w:themeColor="accent6"/>
               </w:rPr>
-              <w:t>The direction of each vector changes</w:t>
+              <w:t>. The purpose of this exercise is to emphasise that eigenvector =&gt; invariant but invariant does not imply eigenvector (common misconception)</w:t>
             </w:r>
           </w:p>
           <w:p/>
@@ -975,7 +960,6 @@
               </w:rPr>
               <w:t>[</w:t>
             </w:r>
-            <w:proofErr w:type="spellStart"/>
             <w:r>
               <w:rPr>
                 <w:rFonts w:ascii="Consolas" w:hAnsi="Consolas"/>
@@ -986,7 +970,6 @@
               </w:rPr>
               <w:t>i</w:t>
             </w:r>
-            <w:proofErr w:type="spellEnd"/>
             <w:r>
               <w:rPr>
                 <w:rFonts w:ascii="Consolas" w:hAnsi="Consolas"/>
@@ -1088,6 +1071,12 @@
                 <w:color w:val="4EA72E" w:themeColor="accent6"/>
               </w:rPr>
               <w:t>Eigenvalues describe scale. Eigenvectors are directions that are unchanged</w:t>
+            </w:r>
+            <w:r>
+              <w:rPr>
+                <w:color w:val="4EA72E" w:themeColor="accent6"/>
+              </w:rPr>
+              <w:t xml:space="preserve"> (or flipped)</w:t>
             </w:r>
           </w:p>
           <w:p>

</xml_diff>